<commit_message>
DSGVO von Herrn Draheim (v2)
</commit_message>
<xml_diff>
--- a/Datenschutzerklärung_Daniel_Weber_Englisch.docx
+++ b/Datenschutzerklärung_Daniel_Weber_Englisch.docx
@@ -96,29 +96,85 @@
         <w:rPr>
           <w:lang w:val="en-US"/>
         </w:rPr>
-        <w:t>(2) Responsible acc. Article 4 (7) of the EU General Data Protection Regulation (GDPR) is Mr Daniel Weber, Arndtstrasse 8, 52064 Aachen, webmaster@danielcweber.net.</w:t>
-      </w:r>
-    </w:p>
-    <w:p>
-      <w:pPr>
-        <w:spacing w:after="0"/>
-        <w:rPr>
-          <w:lang w:val="en-US"/>
-        </w:rPr>
-      </w:pPr>
-    </w:p>
-    <w:p>
-      <w:pPr>
-        <w:spacing w:after="0"/>
-        <w:rPr>
-          <w:lang w:val="en-US"/>
-        </w:rPr>
-      </w:pPr>
-      <w:r>
-        <w:rPr>
-          <w:lang w:val="en-US"/>
-        </w:rPr>
-        <w:t>(3) When you contact us by e-mail or using a contact form, the data you provide (your e-mail address and your name) will be saved by us in order to answer your questions. The data processing for the purpose of contacting us takes place in accordance with Art. 6 Paragraph 1 Sentence 1 Letter a GDPR on the basis of your voluntarily given consent. We delete the data that arises in this context after it is no longer required to store it, or we limit processing if there are statutory retention requirements.</w:t>
+        <w:t xml:space="preserve">(2) Responsible acc. Article 4 (7) of the EU General Data Protection Regulation (GDPR) is </w:t>
+      </w:r>
+      <w:proofErr w:type="spellStart"/>
+      <w:r>
+        <w:rPr>
+          <w:lang w:val="en-US"/>
+        </w:rPr>
+        <w:t>Mr</w:t>
+      </w:r>
+      <w:proofErr w:type="spellEnd"/>
+      <w:r>
+        <w:rPr>
+          <w:lang w:val="en-US"/>
+        </w:rPr>
+        <w:t xml:space="preserve"> Daniel Weber, </w:t>
+      </w:r>
+      <w:proofErr w:type="spellStart"/>
+      <w:r>
+        <w:rPr>
+          <w:lang w:val="en-US"/>
+        </w:rPr>
+        <w:t>Arndtstrasse</w:t>
+      </w:r>
+      <w:proofErr w:type="spellEnd"/>
+      <w:r>
+        <w:rPr>
+          <w:lang w:val="en-US"/>
+        </w:rPr>
+        <w:t xml:space="preserve"> 8, 52064 Aachen, webmaster@danielcweber.net.</w:t>
+      </w:r>
+    </w:p>
+    <w:p>
+      <w:pPr>
+        <w:spacing w:after="0"/>
+        <w:rPr>
+          <w:lang w:val="en-US"/>
+        </w:rPr>
+      </w:pPr>
+    </w:p>
+    <w:p>
+      <w:pPr>
+        <w:spacing w:after="0"/>
+        <w:rPr>
+          <w:lang w:val="en-US"/>
+        </w:rPr>
+      </w:pPr>
+      <w:r>
+        <w:rPr>
+          <w:lang w:val="en-US"/>
+        </w:rPr>
+        <w:t xml:space="preserve">(3) When you contact us by e-mail or using a contact form, the data you provide (your e-mail address and your name) will be saved by us </w:t>
+      </w:r>
+      <w:proofErr w:type="gramStart"/>
+      <w:r>
+        <w:rPr>
+          <w:lang w:val="en-US"/>
+        </w:rPr>
+        <w:t>in order to</w:t>
+      </w:r>
+      <w:proofErr w:type="gramEnd"/>
+      <w:r>
+        <w:rPr>
+          <w:lang w:val="en-US"/>
+        </w:rPr>
+        <w:t xml:space="preserve"> answer your questions. The data processing for the purpose of contacting us takes place in accordance with Art. 6 Paragraph 1 Sentence 1 Letter a GDPR </w:t>
+      </w:r>
+      <w:proofErr w:type="gramStart"/>
+      <w:r>
+        <w:rPr>
+          <w:lang w:val="en-US"/>
+        </w:rPr>
+        <w:t>on the basis of</w:t>
+      </w:r>
+      <w:proofErr w:type="gramEnd"/>
+      <w:r>
+        <w:rPr>
+          <w:lang w:val="en-US"/>
+        </w:rPr>
+        <w:t xml:space="preserve"> your voluntarily given consent. We delete the data that arises in this context after it is no longer required to store it, or we limit processing if there are statutory retention requirements.</w:t>
       </w:r>
     </w:p>
     <w:p>
@@ -184,7 +240,21 @@
         <w:rPr>
           <w:lang w:val="en-US"/>
         </w:rPr>
-        <w:t xml:space="preserve"> (1) You have the following rights vis-à-vis us with regard to your personal data:</w:t>
+        <w:t xml:space="preserve"> (1) You have the following rights vis-à-vis us </w:t>
+      </w:r>
+      <w:proofErr w:type="gramStart"/>
+      <w:r>
+        <w:rPr>
+          <w:lang w:val="en-US"/>
+        </w:rPr>
+        <w:t>with regard to</w:t>
+      </w:r>
+      <w:proofErr w:type="gramEnd"/>
+      <w:r>
+        <w:rPr>
+          <w:lang w:val="en-US"/>
+        </w:rPr>
+        <w:t xml:space="preserve"> your personal data:</w:t>
       </w:r>
     </w:p>
     <w:p>
@@ -328,7 +398,23 @@
         <w:rPr>
           <w:lang w:val="en-US"/>
         </w:rPr>
-        <w:t>(1) If you only use the website for informational purposes, i.e. if you do not register or otherwise provide us with information, we only collect the personal data that your browser transmits to our server. If you want to view our website, we collect the following data, which is technically necessary for us to display our website to you and to guarantee stability and security (legal basis is Art. 6 Para. 1 S. 1 lit.f GDPR ):</w:t>
+        <w:t xml:space="preserve">(1) If you only use the website for informational purposes, i.e. if you do not register or otherwise provide us with information, we only collect the personal data that your browser transmits to our server. If you want to view our website, we collect the following data, which is technically necessary for us to display our website to you and to guarantee stability and security (legal basis is Art. 6 Para. 1 S. 1 </w:t>
+      </w:r>
+      <w:proofErr w:type="spellStart"/>
+      <w:proofErr w:type="gramStart"/>
+      <w:r>
+        <w:rPr>
+          <w:lang w:val="en-US"/>
+        </w:rPr>
+        <w:t>lit.f</w:t>
+      </w:r>
+      <w:proofErr w:type="spellEnd"/>
+      <w:proofErr w:type="gramEnd"/>
+      <w:r>
+        <w:rPr>
+          <w:lang w:val="en-US"/>
+        </w:rPr>
+        <w:t xml:space="preserve"> GDPR ):</w:t>
       </w:r>
     </w:p>
     <w:p>
@@ -499,7 +585,21 @@
         <w:rPr>
           <w:lang w:val="en-US"/>
         </w:rPr>
-        <w:t>(2) Our website uses neither cookies nor trackers. Should this change due to a change by the hoster, we will inform you about it.</w:t>
+        <w:t xml:space="preserve">(2) Our website uses neither cookies nor trackers. Should this change due to a change by the </w:t>
+      </w:r>
+      <w:proofErr w:type="spellStart"/>
+      <w:r>
+        <w:rPr>
+          <w:lang w:val="en-US"/>
+        </w:rPr>
+        <w:t>hoster</w:t>
+      </w:r>
+      <w:proofErr w:type="spellEnd"/>
+      <w:r>
+        <w:rPr>
+          <w:lang w:val="en-US"/>
+        </w:rPr>
+        <w:t>, we will inform you about it.</w:t>
       </w:r>
     </w:p>
     <w:p>
@@ -565,7 +665,21 @@
         <w:rPr>
           <w:lang w:val="en-US"/>
         </w:rPr>
-        <w:t>(2) If we base the processing of your personal data on the balancing of interests, you can object to the processing. This is the case, in particular, if the processing is not required to fulfill a contract with you, which we will describe in the following description of the functions. When exercising such an objection, we ask you to explain the reasons why we should not process your personal data as we have done. In the event of your justified objection, we will examine the situation and either stop or adjust the data processing or point out to you our compelling reasons worthy of protection on the basis of which we will continue processing.</w:t>
+        <w:t>(2) If we base the processing of your personal data on the balancing of interests, you can object to the processing. This is the case</w:t>
+      </w:r>
+      <w:proofErr w:type="gramStart"/>
+      <w:r>
+        <w:rPr>
+          <w:lang w:val="en-US"/>
+        </w:rPr>
+        <w:t>, in particular, if</w:t>
+      </w:r>
+      <w:proofErr w:type="gramEnd"/>
+      <w:r>
+        <w:rPr>
+          <w:lang w:val="en-US"/>
+        </w:rPr>
+        <w:t xml:space="preserve"> the processing is not required to fulfill a contract with you, which we will describe in the following description of the functions. When exercising such an objection, we ask you to explain the reasons why we should not process your personal data as we have done. In the event of your justified objection, we will examine the situation and either stop or adjust the data processing or point out to you our compelling reasons worthy of protection on the basis of which we will continue processing.</w:t>
       </w:r>
     </w:p>
     <w:p>
@@ -832,7 +946,21 @@
           <w:lang w:val="en-US"/>
         </w:rPr>
         <w:lastRenderedPageBreak/>
-        <w:t>(1) In some cases, we use external service providers to process your data. These have been carefully selected and commissioned by us, are bound by our instructions and are checked regularly.</w:t>
+        <w:t xml:space="preserve">(1) In some cases, we use external service providers to process your data. These have been carefully selected and commissioned by us, are bound by our </w:t>
+      </w:r>
+      <w:proofErr w:type="gramStart"/>
+      <w:r>
+        <w:rPr>
+          <w:lang w:val="en-US"/>
+        </w:rPr>
+        <w:t>instructions</w:t>
+      </w:r>
+      <w:proofErr w:type="gramEnd"/>
+      <w:r>
+        <w:rPr>
+          <w:lang w:val="en-US"/>
+        </w:rPr>
+        <w:t xml:space="preserve"> and are checked regularly.</w:t>
       </w:r>
     </w:p>
     <w:p>
@@ -888,7 +1016,21 @@
         <w:rPr>
           <w:lang w:val="en-US"/>
         </w:rPr>
-        <w:t xml:space="preserve"> twitter. We use the so-called two-click solution. This means that when you visit our site, no personal data is initially passed on to the plug-in providers. You can recognize the provider of the plug-in by the marking on the box above its initial letter or the logo. We give you the opportunity to use the button to communicate directly with the provider of the plug-in. Only if you click on the marked field and thereby activate it will the plug-in provider receive the information that you have accessed the corresponding website of our online offer. In addition, the data mentioned under Section 3 of this declaration will be transmitted. In the case of Facebook and Xing, according to the respective providers in Germany, the IP address is anonymized immediately after it is collected. By activating the plug-in, your personal data will be transmitted to the respective plug-in provider and stored there (in the case of US providers in the USA). Since the plug-in provider collects data in particular via cookies, we recommend that you delete all cookies using the security settings of your browser before clicking on the grayed-out box.</w:t>
+        <w:t xml:space="preserve"> twitter. We use the so-called two-click solution. This means that when you visit our site, no personal data is initially passed on to the plug-in providers. You can recognize the provider of the plug-in by the marking on the box above its initial letter or the logo. We give you the opportunity to use the button to communicate directly with the provider of the plug-in. Only if you click on the marked field and thereby activate it will the plug-in provider receive the information that you have accessed the corresponding website of our online offer. In addition, the data mentioned under Section 3 of this declaration will be transmitted. By activating the plug-in, your personal data will be transmitted to the respective plug-in provider and stored there (in the case of US providers in the USA). Since the plug-in provider collects data </w:t>
+      </w:r>
+      <w:proofErr w:type="gramStart"/>
+      <w:r>
+        <w:rPr>
+          <w:lang w:val="en-US"/>
+        </w:rPr>
+        <w:t>in particular via</w:t>
+      </w:r>
+      <w:proofErr w:type="gramEnd"/>
+      <w:r>
+        <w:rPr>
+          <w:lang w:val="en-US"/>
+        </w:rPr>
+        <w:t xml:space="preserve"> cookies, we recommend that you delete all cookies using the security settings of your browser before clicking on the grayed-out box.</w:t>
       </w:r>
     </w:p>
     <w:p>
@@ -932,7 +1074,21 @@
         <w:rPr>
           <w:lang w:val="en-US"/>
         </w:rPr>
-        <w:t>(2c) The plug-in provider saves the data collected about you as a user profile and uses this for advertising, market research and / or needs-based design of its website. Such an evaluation takes place in particular (even for users who are not logged in) to display needs-based advertising and to inform other users of the social network about your activities on our website. You have the right to object to the creation of these user profiles, although you must contact the respective plug-in provider to exercise this right. Via the plug-ins, we offer you the opportunity to interact with social networks and other users, so that we can improve our offer and make it more interesting for you as a user. The legal basis for using the plug-ins is Art. 6 Para. 1 S. 1 lit. f GDPR.</w:t>
+        <w:t xml:space="preserve">(2c) The plug-in provider saves the data collected about you as a user profile and uses this for advertising, market research and / or needs-based design of its website. Such an evaluation takes </w:t>
+      </w:r>
+      <w:proofErr w:type="gramStart"/>
+      <w:r>
+        <w:rPr>
+          <w:lang w:val="en-US"/>
+        </w:rPr>
+        <w:t>place in particular</w:t>
+      </w:r>
+      <w:proofErr w:type="gramEnd"/>
+      <w:r>
+        <w:rPr>
+          <w:lang w:val="en-US"/>
+        </w:rPr>
+        <w:t xml:space="preserve"> (even for users who are not logged in) to display needs-based advertising and to inform other users of the social network about your activities on our website. You have the right to object to the creation of these user profiles, although you must contact the respective plug-in provider to exercise this right. Via the plug-ins, we offer you the opportunity to interact with social networks and other users, so that we can improve our offer and make it more interesting for you as a user. The legal basis for using the plug-ins is Art. 6 Para. 1 S. 1 lit. f GDPR.</w:t>
       </w:r>
     </w:p>
     <w:p>
@@ -1020,28 +1176,43 @@
         <w:rPr>
           <w:lang w:val="en-US"/>
         </w:rPr>
-        <w:t>(3a) LinkedIn Corporation, 2029 Stierlin Court, Mountain View, California 94043, USA; http://www.linkedin.com/legal/privacy-policy.</w:t>
-      </w:r>
-    </w:p>
-    <w:p>
-      <w:pPr>
-        <w:spacing w:after="0"/>
-        <w:rPr>
-          <w:lang w:val="en-US"/>
-        </w:rPr>
-      </w:pPr>
-    </w:p>
-    <w:p>
-      <w:pPr>
-        <w:spacing w:after="0"/>
-        <w:rPr>
-          <w:lang w:val="en-US"/>
-        </w:rPr>
-      </w:pPr>
-      <w:r>
-        <w:rPr>
-          <w:lang w:val="en-US"/>
-        </w:rPr>
+        <w:t xml:space="preserve">(3a) LinkedIn Corporation, 2029 </w:t>
+      </w:r>
+      <w:proofErr w:type="spellStart"/>
+      <w:r>
+        <w:rPr>
+          <w:lang w:val="en-US"/>
+        </w:rPr>
+        <w:t>Stierlin</w:t>
+      </w:r>
+      <w:proofErr w:type="spellEnd"/>
+      <w:r>
+        <w:rPr>
+          <w:lang w:val="en-US"/>
+        </w:rPr>
+        <w:t xml:space="preserve"> Court, Mountain View, California 94043, USA; http://www.linkedin.com/legal/privacy-policy.</w:t>
+      </w:r>
+    </w:p>
+    <w:p>
+      <w:pPr>
+        <w:spacing w:after="0"/>
+        <w:rPr>
+          <w:lang w:val="en-US"/>
+        </w:rPr>
+      </w:pPr>
+    </w:p>
+    <w:p>
+      <w:pPr>
+        <w:spacing w:after="0"/>
+        <w:rPr>
+          <w:lang w:val="en-US"/>
+        </w:rPr>
+      </w:pPr>
+      <w:r>
+        <w:rPr>
+          <w:lang w:val="en-US"/>
+        </w:rPr>
+        <w:lastRenderedPageBreak/>
         <w:t>(3b) Twitter, Inc., 1355 Market St, Suite 900, San Francisco, California 94103, USA; https://twitter.com/privacy.</w:t>
       </w:r>
     </w:p>
@@ -1064,7 +1235,43 @@
         <w:rPr>
           <w:lang w:val="en-US"/>
         </w:rPr>
-        <w:t xml:space="preserve">(4) This website was created via GitHub using the themes of Jekyll (www.jekyllrb.com) and Minimal Mistakes (www.mademistakes.com; data protection declaration: https://mademistakes.com/terms/). We have neither a cooperation with the operators of this website, nor do we send </w:t>
+        <w:t>(4) This website was created via GitHub</w:t>
+      </w:r>
+      <w:r>
+        <w:rPr>
+          <w:lang w:val="en-US"/>
+        </w:rPr>
+        <w:t xml:space="preserve"> (</w:t>
+      </w:r>
+      <w:r>
+        <w:rPr>
+          <w:lang w:val="en-US"/>
+        </w:rPr>
+        <w:t>data protection declaration</w:t>
+      </w:r>
+      <w:r>
+        <w:rPr>
+          <w:lang w:val="en-US"/>
+        </w:rPr>
+        <w:t xml:space="preserve">: </w:t>
+      </w:r>
+      <w:r>
+        <w:rPr>
+          <w:lang w:val="en-US"/>
+        </w:rPr>
+        <w:t>https://docs.github.com/en/free-pro-team@latest/github/site-policy/github-privacy-statement</w:t>
+      </w:r>
+      <w:r>
+        <w:rPr>
+          <w:lang w:val="en-US"/>
+        </w:rPr>
+        <w:t>)</w:t>
+      </w:r>
+      <w:r>
+        <w:rPr>
+          <w:lang w:val="en-US"/>
+        </w:rPr>
+        <w:t xml:space="preserve"> using the themes of Jekyll (www.jekyllrb.com) and Minimal Mistakes (www.mademistakes.com; data protection declaration: https://mademistakes.com/terms/). We have neither a cooperation with the operators of this website, nor do we send </w:t>
       </w:r>
       <w:r>
         <w:rPr>
@@ -1120,7 +1327,21 @@
         <w:rPr>
           <w:lang w:val="en-US"/>
         </w:rPr>
-        <w:t>We use the popular SSL (Secure Socket Layer) method in conjunction with the highest level of encryption supported by your browser when you visit our website. Usually this is a 256 bit encryption. If your browser does not support 256-bit encryption, we use 128-bit v3 technology instead. You can tell whether an individual page of our website is being transmitted in encrypted form by the closed key or lock symbol in the lower status bar of your browser.</w:t>
+        <w:t xml:space="preserve">We use the popular SSL (Secure Socket Layer) method in conjunction with the highest level of encryption supported by your browser when you visit our website. Usually this is a </w:t>
+      </w:r>
+      <w:proofErr w:type="gramStart"/>
+      <w:r>
+        <w:rPr>
+          <w:lang w:val="en-US"/>
+        </w:rPr>
+        <w:t>256 bit</w:t>
+      </w:r>
+      <w:proofErr w:type="gramEnd"/>
+      <w:r>
+        <w:rPr>
+          <w:lang w:val="en-US"/>
+        </w:rPr>
+        <w:t xml:space="preserve"> encryption. If your browser does not support 256-bit encryption, we use 128-bit v3 technology instead. You can tell whether an individual page of our website is being transmitted in encrypted form by the closed key or lock symbol in the lower status bar of your browser.</w:t>
       </w:r>
     </w:p>
     <w:p>

</xml_diff>